<commit_message>
docs: memperbarui link repository pada laporan
</commit_message>
<xml_diff>
--- a/laporan/Laporan_Tugas_Akhir_Aplikasi_Perpustakaan_Azay_Agustian.docx
+++ b/laporan/Laporan_Tugas_Akhir_Aplikasi_Perpustakaan_Azay_Agustian.docx
@@ -2054,6 +2054,7 @@
         <w:spacing w:after="60"/>
       </w:pPr>
       <w:r>
+        <w:lastRenderedPageBreak/>
         <w:t>Menerapkan struktur project dengan package model, view, controller, dao, config, dan report.</w:t>
       </w:r>
     </w:p>
@@ -2134,6 +2135,7 @@
           <w:rFonts w:ascii="Times New Roman" w:hAnsi="Times New Roman"/>
           <w:color w:val="000000"/>
         </w:rPr>
+        <w:lastRenderedPageBreak/>
         <w:t>BAB II  LANDASAN TEORI</w:t>
       </w:r>
       <w:bookmarkEnd w:id="6"/>
@@ -2195,11 +2197,7 @@
         <w:jc w:val="both"/>
       </w:pPr>
       <w:r>
-        <w:t xml:space="preserve">Konsep pemrograman berorientasi objek diterapkan melalui class model seperti Buku dan User. Operasi CRUD diterapkan pada data buku sehingga pengguna dapat menambah, melihat, mengubah, dan menghapus data. Henderson (2017) menjelaskan bahwa software engineering tidak hanya berkaitan dengan penulisan kode, tetapi juga praktik pengembangan agar perangkat lunak dapat dipelihara dan dikembangkan dalam jangka panjang. Hal ini relevan dengan </w:t>
-      </w:r>
-      <w:r>
-        <w:lastRenderedPageBreak/>
-        <w:t>project karena pemisahan package model, view, controller, dao, config, dan report membantu struktur kode menjadi lebih mudah dipahami dan dikembangkan.</w:t>
+        <w:t>Konsep pemrograman berorientasi objek diterapkan melalui class model seperti Buku dan User. Operasi CRUD diterapkan pada data buku sehingga pengguna dapat menambah, melihat, mengubah, dan menghapus data. Henderson (2017) menjelaskan bahwa software engineering tidak hanya berkaitan dengan penulisan kode, tetapi juga praktik pengembangan agar perangkat lunak dapat dipelihara dan dikembangkan dalam jangka panjang. Hal ini relevan dengan project karena pemisahan package model, view, controller, dao, config, dan report membantu struktur kode menjadi lebih mudah dipahami dan dikembangkan.</w:t>
       </w:r>
     </w:p>
     <w:p>
@@ -2233,7 +2231,11 @@
         <w:jc w:val="both"/>
       </w:pPr>
       <w:r>
-        <w:t>Penyimpanan data menggunakan MySQL/MariaDB melalui JDBC. Oracle (2024b) menjelaskan bahwa JDBC merupakan API standar Java yang digunakan untuk mengakses database relasional. Pada aplikasi ini, JDBC digunakan untuk menghubungkan aplikasi Java Swing dengan database db_perpustakaan_231011402845.</w:t>
+        <w:t xml:space="preserve">Penyimpanan data menggunakan MySQL/MariaDB melalui JDBC. Oracle (2024b) menjelaskan bahwa JDBC merupakan API standar Java yang digunakan untuk mengakses database relasional. Pada aplikasi ini, JDBC digunakan untuk </w:t>
+      </w:r>
+      <w:r>
+        <w:lastRenderedPageBreak/>
+        <w:t>menghubungkan aplikasi Java Swing dengan database db_perpustakaan_231011402845.</w:t>
       </w:r>
     </w:p>
     <w:p>
@@ -2263,6 +2265,7 @@
           <w:rFonts w:ascii="Times New Roman" w:hAnsi="Times New Roman"/>
           <w:color w:val="000000"/>
         </w:rPr>
+        <w:lastRenderedPageBreak/>
         <w:t>BAB III  ANALISIS &amp; PERANCANGAN</w:t>
       </w:r>
       <w:bookmarkEnd w:id="10"/>
@@ -3082,7 +3085,6 @@
               <w:rPr>
                 <w:sz w:val="20"/>
               </w:rPr>
-              <w:lastRenderedPageBreak/>
               <w:t>nama_lengkap</w:t>
             </w:r>
           </w:p>
@@ -3171,6 +3173,7 @@
         <w:spacing w:after="60"/>
       </w:pPr>
       <w:r>
+        <w:lastRenderedPageBreak/>
         <w:t>Aplikasi menampilkan form login.</w:t>
       </w:r>
     </w:p>
@@ -5578,7 +5581,10 @@
     </w:p>
     <w:p>
       <w:r>
-        <w:t>Link Repository GitHub: https://github.com/JayyLogic/ta-perpustakaan-java-swing</w:t>
+        <w:t>Link Repository GitHub: https://github.com/JayyLogic/ta-perpustakaan-</w:t>
+      </w:r>
+      <w:r>
+        <w:t>azay-agustian</w:t>
       </w:r>
     </w:p>
     <w:p>

</xml_diff>